<commit_message>
J'ai relu la partie bibliographie. J'ai fait des commentaires dans le texte à relire en mode source.
</commit_message>
<xml_diff>
--- a/manuscrit_joanna.docx
+++ b/manuscrit_joanna.docx
@@ -138,7 +138,7 @@
         <w:pStyle w:val="BodyText"/>
       </w:pPr>
       <w:r>
-        <w:t xml:space="preserve">La longévité des vaches laitières a une importance à la fois économique, écologique et sociale. En effet, il a été montré que le fait de garder un animal dans le troupeau plus longtemps permet de réduire le nombre de génisses à élever pour le renouvellement et donc de réduire le nombre d’animaux improductifs. Cela permet également de réduire l’émission de gaz à effet de serre de l’élevage en ayant moins d’animaux sur l’exploitation</w:t>
+        <w:t xml:space="preserve">La longévité des vaches laitières a une importance à la fois économique, écologique et sociale. En effet, il a été montré que le fait de garder un animal dans le troupeau plus longtemps permet de réduire le nombre de génisses à élever pour le renouvellement et donc de réduire le nombre d’animaux improductifs. Cela permet également de réduire les émissions de gaz à effet de serre de l’élevage en ayant moins d’animaux sur l’exploitation</w:t>
       </w:r>
       <w:r>
         <w:t xml:space="preserve"> </w:t>
@@ -164,7 +164,7 @@
         <w:pStyle w:val="BodyText"/>
       </w:pPr>
       <w:r>
-        <w:t xml:space="preserve">La réforme en élevage laitier se définit comme la sortie de l’animal du troupeau pour être envoyé à l’abattoir dans le but de produire de la viande. On distingue classiquement deux types de réformes : la réforme volontaire qui intervient généralement suite à la décision de l’éleveur de réformer pour production laitière insuffisante. Et la réforme involontaire, liée à un problème de santé ou de reproduction, qui sans cela n’aurait pas entraîné la réforme de l’animal. Les principales causes de réforme en élevage laitier sont les troubles de reproduction, les problèmes locomoteurs ainsi que les infections intramammaires</w:t>
+        <w:t xml:space="preserve">La réforme en élevage laitier se définit comme la sortie d’un animal du troupeau pour être envoyé à l’abattoir dans le but de produire de la viande. On distingue classiquement deux types de réformes : la réforme volontaire qui intervient généralement suite à la décision de l’éleveur de réformer pour production laitière insuffisante. Et la réforme involontaire, liée à un problème de santé ou de reproduction, qui sans cela n’aurait pas entraîné la réforme de l’animal. Les principales causes de réforme en élevage laitier sont les troubles de reproduction, les problèmes locomoteurs ainsi que les infections intramammaires</w:t>
       </w:r>
       <w:r>
         <w:t xml:space="preserve"> </w:t>
@@ -208,7 +208,7 @@
         <w:pStyle w:val="FirstParagraph"/>
       </w:pPr>
       <w:r>
-        <w:t xml:space="preserve">La réforme se définit comme le retrait d’un animal vivant de l’élevage pour l’envoi à l’abattoir, dans le but de produire de la viande et des sous-produits. Elle se dinstingue de la mortalité qui se définit comme la mort de l’animal au sein de l’élevage, que ce soit par l’euthanasie ou la mort naturelle.</w:t>
+        <w:t xml:space="preserve">La réforme se définit comme le retrait d’un animal vivant de l’élevage pour l’envoi à l’abattoir, dans le but de produire de la viande et des sous-produits. Elle se distingue de la mortalité qui se définit comme la mort de l’animal au sein de l’élevage, que ce soit par l’euthanasie ou la mort naturelle.</w:t>
       </w:r>
     </w:p>
     <w:bookmarkStart w:id="21" w:name="principales-causes-de-réforme"/>
@@ -225,7 +225,7 @@
         <w:pStyle w:val="FirstParagraph"/>
       </w:pPr>
       <w:r>
-        <w:t xml:space="preserve">Comme il a été expliqué dans l’introduction, on distingue classiquement deux catégories de réforme. Une réforme volontaire, pour production laitière insuffisante, et une réforme involontaire. Cette dernière est souvent la conséquence d’une maladie ou d’un trouble obligeant à l’éleveur à se séparer de sa vache de manière précoce par rapport à ses attentes de production. La réforme involontaire peut être nécessaire pour éviter de garder un animal en souffrance ou malade trop longtemps mais à l’échelle du troupeau, un taux de réformes involontaire trop élevé souligne un problème de conduite de l’élevage. Des études se penchent sur les principales causes de réforme depuis longtemps, les causes sont le plus souvent variables et dépendantes des considérations économiques et techniques. Elles varient beaucoup selon le type de production et de gestion des troupeaux. De plus souvent les études se concentrent sur une cause en particulier et sur son effet direct alors que les causes peuvent également être indirectes par le biais d’une baisse de production ou de productivité</w:t>
+        <w:t xml:space="preserve">On distingue classiquement deux catégories de réforme. Une réforme volontaire, pour production laitière insuffisante, et une réforme involontaire. Cette dernière est souvent la conséquence d’une maladie ou d’un trouble obligeant à l’éleveur à se séparer de sa vache de manière précoce par rapport à ses attentes de production. La réforme involontaire peut être nécessaire pour éviter de garder un animal en souffrance ou malade trop longtemps mais à l’échelle du troupeau, un taux de réformes involontaire trop élevé souligne un problème de conduite de l’élevage. Des études se penchent sur les principales causes de réforme depuis longtemps. Les causes sont le plus souvent variables et dépendantes des considérations économiques et techniques. Elles varient beaucoup selon le type de production et de gestion des troupeaux. De plus souvent les études se concentrent sur une cause en particulier et sur son effet direct alors que les causes peuvent également être indirectes par le biais d’une baisse de production ou de productivité</w:t>
       </w:r>
       <w:r>
         <w:t xml:space="preserve"> </w:t>
@@ -243,7 +243,7 @@
         <w:t xml:space="preserve">(Rilanto et al. 2020)</w:t>
       </w:r>
       <w:r>
-        <w:t xml:space="preserve">. Au Quebec, une étude sur les risques à l’échelle de l’individu mais également à l’échelle du troupeau à été menée et a montré qu’il existe une grande variation de l’influence du troupeau sur le risque individuel de réforme</w:t>
+        <w:t xml:space="preserve">. Au Québec, une étude sur les risques à l’échelle de l’individu mais également à l’échelle du troupeau à été menée et a montré qu’il existe une grande variation de l’influence du troupeau sur le risque individuel de réforme</w:t>
       </w:r>
       <w:r>
         <w:t xml:space="preserve"> </w:t>
@@ -269,7 +269,7 @@
         <w:pStyle w:val="BodyText"/>
       </w:pPr>
       <w:r>
-        <w:t xml:space="preserve">Il existe également une différence de l’influence du type de production. Si l’on observe les résultats d’une étude menée en Suède les principales causes de réforme des élevages biologiques sont les infections intramammaires (26,7%), les troubles de fertilité (23,6%) et viennent ensuite les troubles locomoteurs. Alors que pour les élevages conventionnels les principales causes sont les troubles de fertilité en premier (25,9%), les infections intramammaires (20,6%) et ensuite les troubles locomoteurs. L’étude à cependant également montré qu’en première lactation la grande majorité des réformes est provoquée par un trouble de la fertilité que ce soit en élevage biologique ou en élevage conventionnel</w:t>
+        <w:t xml:space="preserve">Il existe également une différence de l’influence du type de production. Si l’on observe les résultats d’une étude menée en Suède, les principales causes de réforme des élevages biologiques sont les infections intramammaires (26,7%), les troubles de fertilité (23,6%) et viennent ensuite les troubles locomoteurs. Alors que pour les élevages conventionnels les principales causes sont les troubles de fertilité en premier (25,9%), les infections intramammaires (20,6%) et ensuite les troubles locomoteurs. L’étude à cependant également montré qu’en première lactation la grande majorité des réformes est provoquée par un trouble de la fertilité que ce soit en élevage biologique ou en élevage conventionnel</w:t>
       </w:r>
       <w:r>
         <w:t xml:space="preserve"> </w:t>
@@ -286,7 +286,7 @@
         <w:pStyle w:val="BodyText"/>
       </w:pPr>
       <w:r>
-        <w:t xml:space="preserve">En élevage biologique au Canada ils ont montré que les troubles de fertilité sont la principale cause de réforme, suivis par les mammites et les boiteries</w:t>
+        <w:t xml:space="preserve">En élevage biologique au Canada,</w:t>
       </w:r>
       <w:r>
         <w:t xml:space="preserve"> </w:t>
@@ -295,7 +295,10 @@
         <w:t xml:space="preserve">(Rozzi, Miglior, and Hand 2007)</w:t>
       </w:r>
       <w:r>
-        <w:t xml:space="preserve">. La hiérarchie entre causes est donc relativement variable d’une étude à l’autre, cependant, toutes s’accordent sur les principales causes. En France également, les troubles de reproduction, les mammites et les boiteries ressortent comme étant les principales causes de réforme</w:t>
+        <w:t xml:space="preserve"> </w:t>
+      </w:r>
+      <w:r>
+        <w:t xml:space="preserve">ont montré que les troubles de fertilité sont la principale cause de réforme, suivis par les mammites et les boiteries. La hiérarchie entre causes est donc relativement variable d’une étude à l’autre, cependant, toutes s’accordent sur les principales causes. En France également, les troubles de reproduction, les mammites et les boiteries ressortent comme étant les principales causes de réforme</w:t>
       </w:r>
       <w:r>
         <w:t xml:space="preserve"> </w:t>
@@ -376,16 +379,13 @@
         <w:t xml:space="preserve">(Rostellato et al. 2021)</w:t>
       </w:r>
       <w:r>
-        <w:t xml:space="preserve">. La première se donne en rang de lactation ou en nombre de lactation</w:t>
+        <w:t xml:space="preserve">. La première se donne en rang de lactation ou en nombre de lactations</w:t>
       </w:r>
       <w:r>
         <w:t xml:space="preserve"> </w:t>
       </w:r>
       <w:r>
         <w:t xml:space="preserve">(Brotherstone, Veerkamp, and Hill 1997)</w:t>
-      </w:r>
-      <w:r>
-        <w:t xml:space="preserve"> </w:t>
       </w:r>
       <w:r>
         <w:t xml:space="preserve">. Elle se définit classiquement comme l’aptitude d’un individu à repousser le moment de la réforme involontaire. Elle débute au moment du premier vêlage et se termine au moment de la réforme ou de la mort de l’animal. La longévité vraie, elle, se définit comme l’aptitude d’un individu à repousser la réforme, involontaire comme volontaire. Certaines publications utilisent la durée de vie productive ou</w:t>
@@ -522,7 +522,7 @@
         <w:t xml:space="preserve"> </w:t>
       </w:r>
       <w:r>
-        <w:t xml:space="preserve">mais pas forcément de changement dans l’incidence des réforme.</w:t>
+        <w:t xml:space="preserve">mais pas forcément de changement dans l’incidence des réformes.</w:t>
       </w:r>
     </w:p>
     <w:p>
@@ -539,7 +539,7 @@
         <w:t xml:space="preserve">(Seegers et al. 1998)</w:t>
       </w:r>
       <w:r>
-        <w:t xml:space="preserve">, annonce un taux de renouvellement annuel de 32,3%. Parmi ce taux de renouvellement, 1,2% correspond à de la mortalité au sein de l’élevage. La longévité productive moyenne des animaux était de 36 mois et sur 4 vaches qui rentraient dans l’élevage, 3 n’arrivaient pas au 5</w:t>
+        <w:t xml:space="preserve">, annonce un taux de renouvellement annuel de 32,3%. Parmi ce taux de renouvellement, 1,2% correspond à de la mortalité au sein de l’élevage. La longévité productive moyenne des animaux était de 36 mois et sur 4 vaches qui rentraient dans l’élevage, 3 n’arrivaient pas en 5</w:t>
       </w:r>
       <w:r>
         <w:rPr>
@@ -551,7 +551,7 @@
         <w:t xml:space="preserve"> </w:t>
       </w:r>
       <w:r>
-        <w:t xml:space="preserve">rang de lactation. Depuis les années 90, ce taux de mortalité semble avoir augmenté en France, avec un taux moyen rapporté de 3,7% en 2005 et 3,8% en 2006</w:t>
+        <w:t xml:space="preserve">lactation. Depuis les années 90, ce taux de mortalité semble avoir augmenté en France, avec un taux moyen rapporté de 3,7% en 2005 et 3,8% en 2006</w:t>
       </w:r>
       <w:r>
         <w:t xml:space="preserve"> </w:t>
@@ -560,7 +560,7 @@
         <w:t xml:space="preserve">(Raboisson et al. 2011)</w:t>
       </w:r>
       <w:r>
-        <w:t xml:space="preserve">. Cette augmentation a également été rapporté dans d’autres études réalisées en France, qui en plus montre cette augmentation du taux de mortalité sur toutes les catégories d’âges</w:t>
+        <w:t xml:space="preserve">. Cette augmentation a également été rapportée dans d’autres études réalisées en France, qui en plus montrent cette augmentation du taux de mortalité sur toutes les catégories d’âges</w:t>
       </w:r>
       <w:r>
         <w:t xml:space="preserve"> </w:t>
@@ -594,7 +594,7 @@
         <w:pStyle w:val="BodyText"/>
       </w:pPr>
       <w:r>
-        <w:t xml:space="preserve">Si l’on s’intéresse et que l’on souhaite comparer ces résultats à un pays voisin , une étude en Espagne sur des données datant de 2006 à 2016 montre un taux de renouvellement variant de 25% à 35% avec une plus grande part de vaches en 2</w:t>
+        <w:t xml:space="preserve">Si l’on s’intéresse et que l’on souhaite comparer ces résultats à un pays voisin, une étude en Espagne sur des données datant de 2006 à 2016 montre un taux de renouvellement variant de 25% à 35% avec une plus grande part de vaches en 2</w:t>
       </w:r>
       <w:r>
         <w:rPr>
@@ -627,7 +627,7 @@
         <w:t xml:space="preserve">(Armengol and Fraile 2018)</w:t>
       </w:r>
       <w:r>
-        <w:t xml:space="preserve">. Cette même étude à trouvé un taux de mortalité assez élevé de 19,4% parmi les animaux sorties. D’après les auteurs ce taux plus élevé par rapport à d’autres publications dans d’autres régions du monde pourrait être attribué à une part plus importante du stress thermique (de Mai à Octobre).</w:t>
+        <w:t xml:space="preserve">. Cette même étude à trouvé un taux de mortalité assez élevé de 19,4% parmi les animaux sortis. D’après les auteurs ce taux plus élevé par rapport à d’autres publications dans d’autres régions du monde pourrait être attribué à une part plus importante du stress thermique (de mai à octobre).</w:t>
       </w:r>
     </w:p>
     <w:p>
@@ -644,7 +644,7 @@
         <w:t xml:space="preserve">(Haine et al. 2017b)</w:t>
       </w:r>
       <w:r>
-        <w:t xml:space="preserve">. ce qui semble simillaire aux chiffres donnés en élevage laitier actuellement.</w:t>
+        <w:t xml:space="preserve">, ce qui semble similaire aux chiffres donnés en élevage laitier actuellement.</w:t>
       </w:r>
     </w:p>
     <w:bookmarkEnd w:id="23"/>
@@ -671,7 +671,7 @@
         <w:t xml:space="preserve">(Stott 1994)</w:t>
       </w:r>
       <w:r>
-        <w:t xml:space="preserve">, et ainsi de suite. L’éleveur doit donc sans cesse évaluer les performances économiques de son troupeau et aussi évaluer ses dépenses. Pour évaluer l’impact économique de la longévité des vaches laitière il est d’abords essentiel de commencer par le commencement, c’est-à-dire le coût de l’élevage des génisses. C’est une période considérée improductive donc ces animaux ne rapportent pour l’instant rien à l’éleveur, bien au contraire. Les éleveurs, dans le schéma classique, gardent la plupart du temps toutes les génisses dans le but du renouvellement. Aux Pays-bas, le coût total d’élevage d’une seule génisse (en prenant en compte le coût de la main d’oeuvre) est d’environ 1567 € pour un âge au premier vêlage de 25 mois en moyenne</w:t>
+        <w:t xml:space="preserve">, et ainsi de suite. L’éleveur doit donc sans cesse évaluer les performances économiques de son troupeau et aussi évaluer ses dépenses. Pour évaluer l’impact économique de la longévité des vaches laitières il est essentiel de prendre en compte le coût de l’élevage des génisses. C’est une période considérée improductive donc ces animaux ne rapportent pour l’instant rien à l’éleveur, mais occasionnent des coûts d’élevage : nourriture, logement… Les éleveurs, dans le schéma classique, gardent la plupart du temps toutes les génisses nées sur l’exploitation pour le renouvellement. Aux Pays-bas, le coût total d’élevage d’une seule génisse (en prenant en compte le coût de la main d’œuvre) est d’environ 1567 € pour un âge au premier vêlage de 25 mois en moyenne</w:t>
       </w:r>
       <w:r>
         <w:t xml:space="preserve"> </w:t>
@@ -680,7 +680,7 @@
         <w:t xml:space="preserve">(Mohd Nor et al. 2012)</w:t>
       </w:r>
       <w:r>
-        <w:t xml:space="preserve">. Ils ont également estimé que ce coût contribue à 13% du coût total de production du lait. Au Royaume-uni, le coup d’élevage d’une génisse à été estimé à 1819 £ ce qui correspond à 2150 € environ</w:t>
+        <w:t xml:space="preserve">. Ils ont également estimé que ce coût contribue à 13% du coût total de production du lait. Au Royaume-Uni, le coup d’élevage d’une génisse à été estimé à 1819 £ ce qui correspond à 2150 € environ</w:t>
       </w:r>
       <w:r>
         <w:t xml:space="preserve"> </w:t>
@@ -689,7 +689,7 @@
         <w:t xml:space="preserve">(Boulton, Rushton, and Wathes 2017)</w:t>
       </w:r>
       <w:r>
-        <w:t xml:space="preserve">. La nourriture ayant la plus grosse contribution à ce coût, suivi de la gestion de la litière et du fumier. Selon cette même étude, cela prendrais environ 1,5 lactation pour rembourser ce coût d’élevage avec un âge au premier vêlage compris entre 23 et 25 mois. Pour s’assurer un âge au premier vêlage le plus tôt possible il faut être certain que la génisse ait atteint un poids suffisant ainsi qu’une morphologie et une maturité sexuelle adéquat avant la mise à la reproduction. En France souvent l’âge au premier vêlage se rapproche plus des 28-30 mois.</w:t>
+        <w:t xml:space="preserve">. La nourriture ayant la plus grosse contribution à ce coût, suivi de la gestion de la litière et du fumier. Selon cette même étude, cela prendrait environ 1,5 lactation pour rembourser ce coût d’élevage avec un âge au premier vêlage compris entre 23 et 25 mois. Pour s’assurer un âge au premier vêlage le plus précoce possible il faut être certain que la génisse ait atteint un poids suffisant ainsi qu’une morphologie et une maturité sexuelle adéquates avant la mise à la reproduction. En France souvent l’âge au premier vêlage se rapproche plus des 28-30 mois.</w:t>
       </w:r>
     </w:p>
     <w:p>
@@ -714,7 +714,7 @@
         <w:pStyle w:val="BodyText"/>
       </w:pPr>
       <w:r>
-        <w:t xml:space="preserve">C’est également la conclusion d’une étude réalisée en Pologne où l’âge moyen à la réforme est de 6 ans après 2,5 à 3 lactations réalisées</w:t>
+        <w:t xml:space="preserve">C’est également la conclusion d’une étude réalisée en Pologne où l’âge moyen à la réforme est de 6 ans après 2,5 à 3 lactations</w:t>
       </w:r>
       <w:r>
         <w:t xml:space="preserve"> </w:t>
@@ -723,7 +723,7 @@
         <w:t xml:space="preserve">(Adamczyk et al. 2017)</w:t>
       </w:r>
       <w:r>
-        <w:t xml:space="preserve">. Selon les auteurs, les vaches réformées de manière involontaire sont réformées deux fois plus tôt que les vaches réformées de manière volontaire et dans les grands troupeaux ce sont souvent les plus hautes productrices qui sont réformées le plus tôt. Or l’étude recommande d’essayer de garder les VL les plus hautes productrices le plus longtemps possible et de ne pas élever toutes les génisses dans le but du renouvellement.</w:t>
+        <w:t xml:space="preserve">. Selon les auteurs, les vaches réformées de manière involontaire sont réformées deux fois plus tôt que les vaches réformées de manière volontaire et dans les grands troupeaux ce sont souvent les plus hautes productrices qui sont réformées le plus tôt. Or l’étude recommande d’essayer de garder les vaches laitières les plus hautes productrices le plus longtemps possible et de ne pas élever toutes les génisses dans le but du renouvellement.</w:t>
       </w:r>
     </w:p>
     <w:bookmarkEnd w:id="24"/>
@@ -750,7 +750,7 @@
         <w:t xml:space="preserve">(Flysjö et al. 2011)</w:t>
       </w:r>
       <w:r>
-        <w:t xml:space="preserve">. Calculer l’empreinte carbone de l’élevage laitier est un processus complexe et souvent les études qui ont cherché à l’estimer ont utilisé des modèles simplifiés. Le résultat obtenu le plus souvent n’est donc pas tout à fait la réalité. Cependant il permet tout de même de comparer différents systèmes de production : par exemple, pour les pays dont le mode d’élevage majoritaire est celui qui maximise le temps de pâturage, l’émission de gaz à effet de serre est principalement liée aux fermentations entériques (&gt;50%). Alors que pour les pays qui ont une majorité d’élevages hors-sol, l’émission de gaz à effet de serre provient principalement de la gestion du lisier, de l’alimentation et de l’utilisation d’intrants pour fertiliser les sols</w:t>
+        <w:t xml:space="preserve">. Calculer l’empreinte carbone de l’élevage laitier est un processus complexe et souvent les études qui ont cherché à l’estimer ont utilisé des modèles simplifiés. Le résultat obtenu le plus souvent n’est donc pas tout à fait la réalité. Il permet tout de même de comparer différents systèmes de production : par exemple, pour les pays dont le mode d’élevage majoritaire est celui qui maximise le temps de pâturage, l’émission de gaz à effet de serre est principalement liée aux fermentations entériques (&gt;50%). Alors que pour les pays qui ont une majorité d’élevages hors-sol, l’émission de gaz à effet de serre provient principalement de la gestion du lisier, de l’alimentation et de l’utilisation d’intrants pour fertiliser les sols</w:t>
       </w:r>
       <w:r>
         <w:t xml:space="preserve"> </w:t>
@@ -759,9 +759,6 @@
         <w:t xml:space="preserve">(Mazzetto, Falconer, and Ledgard 2022)</w:t>
       </w:r>
       <w:r>
-        <w:t xml:space="preserve"> </w:t>
-      </w:r>
-      <w:r>
         <w:t xml:space="preserve">.</w:t>
       </w:r>
     </w:p>
@@ -787,7 +784,7 @@
         <w:pStyle w:val="BodyText"/>
       </w:pPr>
       <w:r>
-        <w:t xml:space="preserve">En suède, une étude conduite entre 2010 et 2018, à démontré une relation positive entre longévité et performances économiques du troupeau. Ils ont également montré une relation en U entre la durée productive moyenne du troupeau et l’efficacité. Cela signifie que l’efficacité augmente avec la durée de vie productive du troupeau mais seulement jusqu’à un certain point</w:t>
+        <w:t xml:space="preserve">En Suède, une étude conduite entre 2010 et 2018, a démontré une relation positive entre longévité et performances économiques du troupeau. Ils ont également montré une relation en U entre la durée productive moyenne du troupeau et l’efficacité. Cela signifie que l’efficacité augmente avec la durée de vie productive du troupeau mais seulement jusqu’à un certain point</w:t>
       </w:r>
       <w:r>
         <w:t xml:space="preserve"> </w:t>
@@ -796,7 +793,7 @@
         <w:t xml:space="preserve">(Adamie et al. 2023)</w:t>
       </w:r>
       <w:r>
-        <w:t xml:space="preserve">. Attention tout de même à l’interprétation car cette étude ne prend en compte qu’une moyenne globale de troupeau et non pas la distribution d’âge au sein du troupeau ni même sa taille.</w:t>
+        <w:t xml:space="preserve">. Attention tout de même à l’interprétation car cette étude ne prend en compte qu’une moyenne globale de troupeau et non pas la distribution d’âges au sein du troupeau ni même sa taille.</w:t>
       </w:r>
     </w:p>
     <w:bookmarkEnd w:id="25"/>
@@ -823,7 +820,7 @@
         <w:t xml:space="preserve">(Schuster et al. 2020)</w:t>
       </w:r>
       <w:r>
-        <w:t xml:space="preserve">. Bien évidemment, aujourd’hui une vache laitière est envoyé à l’abattoir avant cet âge car son vieillissement entraîne rapidement une baisse de production économiquement non désirée.</w:t>
+        <w:t xml:space="preserve">. Bien évidemment, aujourd’hui une vache laitière est envoyée à l’abattoir avant cet âge car son vieillissement entraîne rapidement une baisse de production économiquement non désirée.</w:t>
       </w:r>
     </w:p>
     <w:p>
@@ -891,7 +888,7 @@
         <w:pStyle w:val="BodyText"/>
       </w:pPr>
       <w:r>
-        <w:t xml:space="preserve">Cette constatation semble avoir été faite en Suède, ou l’on constate une réduction des traitements vétérinaire depuis 2009 ainsi qu’un accroissement de la longévité depuis 2015</w:t>
+        <w:t xml:space="preserve">Cette constatation semble avoir été faite en Suède, ou l’on constate une réduction des traitements vétérinaires depuis 2009 ainsi qu’un accroissement de la longévité depuis 2015</w:t>
       </w:r>
       <w:r>
         <w:t xml:space="preserve"> </w:t>
@@ -957,7 +954,7 @@
           <w:iCs/>
           <w:i/>
         </w:rPr>
-        <w:t xml:space="preserve">S.agalactiae</w:t>
+        <w:t xml:space="preserve">S. aureus</w:t>
       </w:r>
       <w:r>
         <w:t xml:space="preserve">,</w:t>
@@ -970,7 +967,7 @@
           <w:iCs/>
           <w:i/>
         </w:rPr>
-        <w:t xml:space="preserve">S.aureus</w:t>
+        <w:t xml:space="preserve">S. agalactiae</w:t>
       </w:r>
       <w:r>
         <w:t xml:space="preserve"> </w:t>
@@ -986,7 +983,7 @@
           <w:iCs/>
           <w:i/>
         </w:rPr>
-        <w:t xml:space="preserve">S.uberis</w:t>
+        <w:t xml:space="preserve">S. uberis</w:t>
       </w:r>
       <w:r>
         <w:t xml:space="preserve"> </w:t>
@@ -1027,7 +1024,7 @@
         <w:t xml:space="preserve"> </w:t>
       </w:r>
       <w:r>
-        <w:t xml:space="preserve">qui pourrait être introduit à la suite de l’achat d’un animal infecté. La transmission se fait d’une vache infectée à une vache saine, généralement au cours de la traite, par le biais des mains de l’éleveur ou des personnes en charge de la traite, des lavettes réutilisées pour plusieurs vaches ou mal désinfectées, ou encore par le biais des manchons trayeurs. Ces pathogènes se propagent rapidement au sein du troupeau car ils provoquent généralement une infection subclinique qui passe facilement inaperçue. Une grosse quantité de bactéries passent dans le lait. De plus ils tendent à provoquer des infections qui passent rapidement à la chronicité avec parfois des épisodes cliniques sporadiques. C’est d’ailleurs souvent lors de ces épisodes cliniques que les éleveurs remarquent l’infection et décident de la traiter mais généralement ces infections répondent mal aux traitements. L’autre modèle présenté est le modèle environemental, avec des germes présent dans l’environement proche de la vache, comme sa litière. Ce sont le plus souvent des germes Gram négatifs issus de matières fécales comme</w:t>
+        <w:t xml:space="preserve">qui pourrait être introduit à la suite de l’achat d’un animal infecté. La transmission se fait d’une vache infectée à une vache saine, généralement au cours de la traite, par le biais des mains de l’éleveur ou des personnes en charge de la traite, des lavettes réutilisées pour plusieurs vaches ou mal désinfectées, ou encore par le biais des manchons trayeurs. Ces pathogènes se propagent rapidement au sein du troupeau car ils provoquent généralement une infection subclinique qui passe facilement inaperçue. Une grosse quantité de bactéries passent dans le lait. De plus ils tendent à provoquer des infections qui passent rapidement à la chronicité avec parfois des épisodes cliniques sporadiques. C’est d’ailleurs souvent lors de ces épisodes cliniques que les éleveurs remarquent l’infection et décident de la traiter mais généralement ces infections répondent mal aux traitements. L’autre modèle présenté est le modèle environnemental, avec des germes présent dans l’environement proche de la vache, comme sa litière. Ce sont le plus souvent des bactéries à Gram négatifs issues de matières fécales comme</w:t>
       </w:r>
       <w:r>
         <w:t xml:space="preserve"> </w:t>
@@ -1037,7 +1034,7 @@
           <w:iCs/>
           <w:i/>
         </w:rPr>
-        <w:t xml:space="preserve">E.coli</w:t>
+        <w:t xml:space="preserve">E. coli</w:t>
       </w:r>
       <w:r>
         <w:t xml:space="preserve">,</w:t>
@@ -1050,7 +1047,7 @@
           <w:iCs/>
           <w:i/>
         </w:rPr>
-        <w:t xml:space="preserve">Klebsiella spp</w:t>
+        <w:t xml:space="preserve">Klebsiella spp.</w:t>
       </w:r>
       <w:r>
         <w:t xml:space="preserve"> </w:t>
@@ -1069,9 +1066,6 @@
         <w:t xml:space="preserve">Enterobacter</w:t>
       </w:r>
       <w:r>
-        <w:t xml:space="preserve">.</w:t>
-      </w:r>
-      <w:r>
         <w:t xml:space="preserve"> </w:t>
       </w:r>
       <w:r>
@@ -1088,13 +1082,13 @@
           <w:iCs/>
           <w:i/>
         </w:rPr>
-        <w:t xml:space="preserve">S.uberis</w:t>
-      </w:r>
-      <w:r>
-        <w:t xml:space="preserve"> </w:t>
-      </w:r>
-      <w:r>
-        <w:t xml:space="preserve">qui peut également suivre ce modèle épidémiologique. Comme il a été dit plus haut, l’infection provient généralement de la litière et aux vues du mode de vie des animaux, il est presque illusoire d’espérer une totale élimination de ces germes de l’environnement. Il est cependant possible d’envisager la réduction de la pression d’infection par des bonnes pratiques d’hygiène afin de garder une litière la plus propre et sèche possible. Ces germes provoquent plus souvent des formes cliniques qui peuvent avoir des conséquences graves voire même entrainer la mort de l’animal. Ce sont souvent des épisodes cliniques qui interviennent juste avant ou après le vêlage pour</w:t>
+        <w:t xml:space="preserve">S. uberis</w:t>
+      </w:r>
+      <w:r>
+        <w:t xml:space="preserve"> </w:t>
+      </w:r>
+      <w:r>
+        <w:t xml:space="preserve">qui peut également suivre ce modèle épidémiologique. Comme il a été dit plus haut, l’infection provient généralement de la litière et au vu du mode de vie des animaux, il est presque illusoire d’espérer une totale élimination de ces germes de l’environnement. Il est cependant possible d’envisager la réduction de la pression d’infection par des bonnes pratiques d’hygiène afin de garder une litière la plus propre et sèche possible. Ces germes provoquent plus souvent des formes cliniques qui peuvent avoir des conséquences graves voire même entraîner la mort de l’animal. Ce sont souvent des épisodes cliniques qui interviennent juste avant ou après le vêlage pour</w:t>
       </w:r>
       <w:r>
         <w:t xml:space="preserve"> </w:t>
@@ -1104,7 +1098,7 @@
           <w:iCs/>
           <w:i/>
         </w:rPr>
-        <w:t xml:space="preserve">E.coli</w:t>
+        <w:t xml:space="preserve">E. coli</w:t>
       </w:r>
       <w:r>
         <w:t xml:space="preserve"> </w:t>
@@ -1120,7 +1114,7 @@
           <w:iCs/>
           <w:i/>
         </w:rPr>
-        <w:t xml:space="preserve">Klebsiella spp</w:t>
+        <w:t xml:space="preserve">Klebsiella spp.</w:t>
       </w:r>
       <w:r>
         <w:t xml:space="preserve">,</w:t>
@@ -1149,7 +1143,7 @@
           <w:iCs/>
           <w:i/>
         </w:rPr>
-        <w:t xml:space="preserve">S.uberis</w:t>
+        <w:t xml:space="preserve">S. uberis</w:t>
       </w:r>
       <w:r>
         <w:t xml:space="preserve">.</w:t>
@@ -1187,7 +1181,7 @@
         <w:pStyle w:val="FirstParagraph"/>
       </w:pPr>
       <w:r>
-        <w:t xml:space="preserve">Une étape importante de cette étude est de donner une définition claire du terme mammite et comment nous pouvons l’intégrer dans l’étude. Une mammite, si on prend la définition littérale, c’est une inflammation de la mamelle. Cette définition, bien que claire, est insuffisante si on souhaite étudier son impact sur la longévité des vaches laitières, car elle donne trop peu d’informations susceptibles de nous indiquer par quels mécanismes une mammite pourrait avoir une influence sur la fin de vie d’un animal. Si on regarde les définitions de mammites utilisées dans la littérature, on remarque qu’il n’y pas de réelle homogénéité dans la définition de mammite. Certains pays comme le Danemark interdisent aux éleveurs l’utilisation d’antibiotiques en automédication, ce qui fait que chaque traitement est administré et enregistré par le vétérinaire lui-même. Il devient alors plus facile d’avoir accès à l’utilisation réelle des traitements et l’indication pour laquelle le traitement a été effectué. C’est ce qu’on décidé des auteurs danois</w:t>
+        <w:t xml:space="preserve">Une étape importante de cette étude est de donner une définition claire du terme mammite et comment nous pouvons l’intégrer dans l’étude. Une mammite, si on prend la définition littérale, c’est une inflammation de la mamelle. Cette définition, bien que claire, est insuffisante si on souhaite étudier son impact sur la longévité des vaches laitières, car elle donne trop peu d’informations susceptibles de nous indiquer par quels mécanismes une mammite pourrait avoir une influence sur la fin de vie d’un animal. Si on regarde les définitions de mammites utilisées dans la littérature, on remarque qu’il n’y pas de réelle homogénéité dans la définition de mammite. Certains pays comme le Danemark interdisent aux éleveurs l’utilisation d’antibiotiques en automédication, ce qui fait que chaque traitement est administré et enregistré par le vétérinaire lui-même. Il devient alors plus facile d’avoir accès à l’utilisation réelle des traitements et l’indication pour laquelle le traitement a été effectué. C’est ce qu’ont décidé des auteurs danois</w:t>
       </w:r>
       <w:r>
         <w:t xml:space="preserve"> </w:t>
@@ -1254,7 +1248,15 @@
         <w:pStyle w:val="FirstParagraph"/>
       </w:pPr>
       <w:r>
-        <w:t xml:space="preserve">La Période de tarissement est une période particulièrement à risque pour les infections intramammaires. C’est une période de transition, les vaches produisent encore du lait mais ne sont pas traites, ce qui entraîne la stagnation du lait en en fait un excellent milieu de culture pour les bactéries. De plus la pression du lait augmente et entraîne l’ouverture du sphincter qui permet l’ouverture du trayon. Ce dernier devient une porte d’entrée idéale pour les germes de l’environnement, d’autant plus sans l’effet mécanique d’évacuation lors de la traite habituelle</w:t>
+        <w:t xml:space="preserve">Il y a beaucoup d’affirmations sans justification : mesures inutiles si recommandations… Influence du la durée de tarissement…</w:t>
+      </w:r>
+    </w:p>
+    <w:p>
+      <w:pPr>
+        <w:pStyle w:val="BodyText"/>
+      </w:pPr>
+      <w:r>
+        <w:t xml:space="preserve">La période de tarissement est une période particulièrement à risque pour les infections intramammaires. C’est une période de transition, les vaches produisent encore du lait mais ne sont pas traites, ce qui entraîne la stagnation du lait et en fait un excellent milieu de culture pour les bactéries. De plus la pression du lait augmente et entraîne l’ouverture du sphincter qui permet l’ouverture du trayon. Ce dernier devient une porte d’entrée idéale pour les germes de l’environnement, d’autant plus sans l’effet mécanique d’évacuation lors de la traite habituelle</w:t>
       </w:r>
       <w:r>
         <w:t xml:space="preserve"> </w:t>
@@ -1264,19 +1266,22 @@
       </w:r>
       <w:r>
         <w:t xml:space="preserve">. Les germes sont donc essentiellement des germes de l’environnement.</w:t>
+      </w:r>
+      <w:r>
+        <w:t xml:space="preserve"> </w:t>
       </w:r>
       <w:r>
         <w:rPr>
           <w:iCs/>
           <w:i/>
         </w:rPr>
-        <w:t xml:space="preserve">E.coli</w:t>
-      </w:r>
-      <w:r>
-        <w:t xml:space="preserve"> </w:t>
-      </w:r>
-      <w:r>
-        <w:t xml:space="preserve">entraîne souvent des infection en période péri-partum, juste avant ou après le vêlage. Tandis que</w:t>
+        <w:t xml:space="preserve">E. coli</w:t>
+      </w:r>
+      <w:r>
+        <w:t xml:space="preserve"> </w:t>
+      </w:r>
+      <w:r>
+        <w:t xml:space="preserve">entraîne souvent des infections en période péri-partum, juste avant ou après le vêlage. Tandis que</w:t>
       </w:r>
       <w:r>
         <w:t xml:space="preserve"> </w:t>
@@ -1286,7 +1291,7 @@
           <w:iCs/>
           <w:i/>
         </w:rPr>
-        <w:t xml:space="preserve">Klebsiella spp</w:t>
+        <w:t xml:space="preserve">Klebsiella spp.</w:t>
       </w:r>
       <w:r>
         <w:t xml:space="preserve"> </w:t>
@@ -1317,7 +1322,7 @@
         <w:t xml:space="preserve">(Garcia 2004)</w:t>
       </w:r>
       <w:r>
-        <w:t xml:space="preserve">. Cette période particulièrement délicate est souvent la période de choix pour traiter les animaux et tenter de guérir une infection existante ou empêcher une nouvelle infection. En effet, durant la lactation les animaux passent à la traite au minimum deux fois par jour et les éleveurs ne peuvent pas se permettre de perdre plusieurs jours de traite afin de traiter sa vache, de plus une étude à montré qu’il n’y pas d’intérêt à traiter une infection subclinique au cours d’une lactation</w:t>
+        <w:t xml:space="preserve">. Cette période particulièrement délicate est souvent la période de choix pour traiter les animaux et tenter de guérir une infection existante ou empêcher une nouvelle infection. En effet, durant la lactation les animaux passent à la traite au minimum deux fois par jour et les éleveurs ne peuvent pas se permettre de perdre plusieurs jours de traite afin de traiter sa vache. De plus une étude à montré qu’il n’y pas d’intérêt à traiter une infection subclinique au cours d’une lactation</w:t>
       </w:r>
       <w:r>
         <w:t xml:space="preserve"> </w:t>
@@ -1326,7 +1331,7 @@
         <w:t xml:space="preserve">(Borne et al. 2019)</w:t>
       </w:r>
       <w:r>
-        <w:t xml:space="preserve">. Un bouchon de kératine se forme naturellement dans le trayon mais en tout début de période de tarissement les vaches sont particulièrement vulnérables. Même principe en toute fin quand la lactogenèse recommence et que ce bouchon tombe. C’est pour cette raison qu’aujourd’hui la très grande majorité des éleveurs mettent en place un bouchon de bizmuth en association ou non avec des antibiotiques lors du tarissement</w:t>
+        <w:t xml:space="preserve">. Un bouchon de kératine se forme naturellement dans le trayon mais en tout début de période de tarissement les vaches sont particulièrement vulnérables. Même principe en toute fin quand la lactogenèse recommence et que ce bouchon tombe. C’est pour cette raison qu’aujourd’hui la très grande majorité des éleveurs mettent en place un bouchon de bismuth en association ou non avec des antibiotiques lors du tarissement</w:t>
       </w:r>
       <w:r>
         <w:t xml:space="preserve"> </w:t>
@@ -1371,7 +1376,7 @@
         <w:t xml:space="preserve">(Bar et al. 2008)</w:t>
       </w:r>
       <w:r>
-        <w:t xml:space="preserve">. Une étude réalisée au Danemark a essayé d’estimer le meilleur modèle économique selon les différentes modalités de traitement en fonction de la présence de cas cliniques et de cas subcliniques. Ils ont montré les meilleurs résultats sur les revenus annuels étaient obtenues quand la priorité était portée sur la prise en charge des mammites subcliniques plutôt que clinique. Que ce soit par le biais de traitement mais également de décison de réforme. De plus cela permettait également de réduire l’apparition de nouveaux cas. Ce modèle montrait cependant de moins bons résultats si l’épidémiologie était environnementale, il est donc primordiale d’adapter la gestion en fonction du troupeau et il faut dans tous les cas être prêt à choisir entre l’usage de traitements médicamenteux ou accepter d’envoyer précocement un animal à l’abattoir. Cette décision est fortement dépendante des caractéristiques de la vache et surtout de son niveau de production laitière</w:t>
+        <w:t xml:space="preserve">. Une étude réalisée au Danemark a essayé d’estimer le meilleur modèle économique selon les différentes modalités de traitement en fonction de la présence de cas cliniques et de cas subcliniques. Ils ont montré les meilleurs résultats sur les revenus annuels étaient obtenus quand la priorité était portée sur la prise en charge des mammites subcliniques plutôt que clinique. Que ce soit par le biais de traitement mais également de décision de réforme. De plus cela permettait de réduire l’apparition de nouveaux cas. Ce modèle montrait cependant de moins bons résultats si l’épidémiologie était environnementale, il est donc primordiale d’adapter la gestion en fonction du troupeau et il faut dans tous les cas être prêt à choisir entre l’usage de traitements médicamenteux ou accepter d’envoyer précocement un animal à l’abattoir. Cette décision est fortement dépendante des caractéristiques de la vache et surtout de son niveau de production laitière</w:t>
       </w:r>
       <w:r>
         <w:t xml:space="preserve"> </w:t>
@@ -1398,16 +1403,7 @@
         <w:t xml:space="preserve">(Bar et al. 2008)</w:t>
       </w:r>
       <w:r>
-        <w:t xml:space="preserve">. Une autre étude à préféré séparer ce coût entre primipares et multipares et a estimé le coût d’une mammite à 326$ pour une primipare et 427$ pour une multipare, avec plus d’un tiers de ces pertes imputables à la baisse et à la perte de production laitière</w:t>
-      </w:r>
-      <w:r>
-        <w:t xml:space="preserve"> </w:t>
-      </w:r>
-      <w:r>
-        <w:t xml:space="preserve">(Liang et al. 2017)</w:t>
-      </w:r>
-      <w:r>
-        <w:t xml:space="preserve">.</w:t>
+        <w:t xml:space="preserve">. Une autre étude a préféré séparer ce coût entre primipares et multipares et a estimé le coût d’une mammite à 326$ pour une primipare et 427$ pour une multipare, avec plus d’un tiers de ces pertes imputables à la baisse et à la perte de production laitière.</w:t>
       </w:r>
     </w:p>
     <w:p>
@@ -1415,7 +1411,7 @@
         <w:pStyle w:val="BodyText"/>
       </w:pPr>
       <w:r>
-        <w:t xml:space="preserve">Ces études sont très utile pour visualiser l’importance des pertes économiques, d’autres études ont voulu aller encore plus loin en estimant les pertes imputables au cas cliniques et aux cas subcliniques mais également en séparant par spécificité de germe</w:t>
+        <w:t xml:space="preserve">Ces études sont très utiles pour visualiser l’importance des pertes économiques, d’autres études ont voulu aller encore plus loin en estimant les pertes imputables au cas cliniques et aux cas subcliniques mais également en séparant par spécificité de germe</w:t>
       </w:r>
       <w:r>
         <w:t xml:space="preserve"> </w:t>
@@ -1434,7 +1430,7 @@
           <w:iCs/>
           <w:i/>
         </w:rPr>
-        <w:t xml:space="preserve">S.aureus</w:t>
+        <w:t xml:space="preserve">S. aureus</w:t>
       </w:r>
       <w:r>
         <w:t xml:space="preserve">,</w:t>
@@ -1447,7 +1443,7 @@
           <w:iCs/>
           <w:i/>
         </w:rPr>
-        <w:t xml:space="preserve">S.uberis</w:t>
+        <w:t xml:space="preserve">S. uberis</w:t>
       </w:r>
       <w:r>
         <w:t xml:space="preserve">,</w:t>
@@ -1460,7 +1456,7 @@
           <w:iCs/>
           <w:i/>
         </w:rPr>
-        <w:t xml:space="preserve">S.dysgalactiae</w:t>
+        <w:t xml:space="preserve">S. dysgalactiae</w:t>
       </w:r>
       <w:r>
         <w:t xml:space="preserve"> </w:t>
@@ -1476,7 +1472,7 @@
           <w:iCs/>
           <w:i/>
         </w:rPr>
-        <w:t xml:space="preserve">E.coli</w:t>
+        <w:t xml:space="preserve">E. coli</w:t>
       </w:r>
       <w:r>
         <w:t xml:space="preserve">. Les résultats finaux montrent que les pertes avec</w:t>
@@ -1489,7 +1485,7 @@
           <w:iCs/>
           <w:i/>
         </w:rPr>
-        <w:t xml:space="preserve">S.dysgalactiae</w:t>
+        <w:t xml:space="preserve">S. dysgalactiae</w:t>
       </w:r>
       <w:r>
         <w:t xml:space="preserve"> </w:t>
@@ -1505,7 +1501,7 @@
           <w:iCs/>
           <w:i/>
         </w:rPr>
-        <w:t xml:space="preserve">S.uberis</w:t>
+        <w:t xml:space="preserve">S. uberis</w:t>
       </w:r>
       <w:r>
         <w:t xml:space="preserve">, 838€ pour</w:t>
@@ -1518,7 +1514,7 @@
           <w:iCs/>
           <w:i/>
         </w:rPr>
-        <w:t xml:space="preserve">E.coli</w:t>
+        <w:t xml:space="preserve">E. coli</w:t>
       </w:r>
       <w:r>
         <w:t xml:space="preserve"> </w:t>
@@ -1534,7 +1530,7 @@
           <w:iCs/>
           <w:i/>
         </w:rPr>
-        <w:t xml:space="preserve">S.aureus</w:t>
+        <w:t xml:space="preserve">S. aureus</w:t>
       </w:r>
       <w:r>
         <w:t xml:space="preserve">. Les variations inter-groupes sont explicables par la différence dans le taux de transmission des différents germes. Les différences intra-groupes étaient également importantes du fait des différences entre niveau de production des vaches laitières mais également leur parité et leur state de lactation.</w:t>
@@ -1563,7 +1559,7 @@
         <w:pStyle w:val="BodyText"/>
       </w:pPr>
       <w:r>
-        <w:t xml:space="preserve">Un certain nombre d’études se sont intéressées à l’implication des mammites dans la réduction de la longévité des vaches laitières, la mammite étant la maladie la plus représentée en élevage laitier.Une étude de survie sur les élevages danois a été faite</w:t>
+        <w:t xml:space="preserve">Un certain nombre d’études se sont intéressées à l’implication des mammites dans la réduction de la longévité des vaches laitières, la mammite étant la maladie la plus représentée en élevage laitier. Une étude de survie sur les élevages danois a été faite</w:t>
       </w:r>
       <w:r>
         <w:t xml:space="preserve"> </w:t>
@@ -1584,7 +1580,7 @@
         <w:t xml:space="preserve"> </w:t>
       </w:r>
       <w:r>
-        <w:t xml:space="preserve">Ils ont cherché à montrer que les vaches avec un SCC moyen par lactation très élevée (SCC &gt; 700 000 cell/mL) avaient 2 à 4 fois plus de chances d’être réformées de manière générale et 10 à 25 fois plus de chances d’être réformées pour cause de mammites. Cette observation est d’autant plus vraie pour les élevages qui maintenant un SCC de troupeau faible, ce qui serait donc le reflet d’une politique de réforme plus sévère dans ces élevages. Ils ont également observé que les vaches avec un SCC très faible étaient également plus à risque d’être réformées, particulièrement dans les élevages avec une forte prévalence de germes responsables de mammites, mais aucune conclusion ne peut encore être émise sur la possible existence d’une résistance immunitaire persistante induite par une première inflammation de la mamelle. Au Canada</w:t>
+        <w:t xml:space="preserve">Ils ont cherché à montrer que les vaches avec un SCC moyen par lactation très élevée (SCC &gt; 700 000 cellules/mL) avaient 2 à 4 fois plus de chances d’être réformées de manière générale et 10 à 25 fois plus de chances d’être réformées pour cause de mammites. Cette observation est d’autant plus vraie pour les élevages qui maintiennent un SCC de troupeau faible, ce qui serait donc le reflet d’une politique de réforme plus sévère dans ces élevages. Ils ont également observé que les vaches avec un SCC très faible étaient également plus à risque d’être réformées, particulièrement dans les élevages avec une forte prévalence de germes responsables de mammites, mais aucune conclusion ne peut encore être émise sur la possible existence d’une résistance immunitaire persistante induite par une première inflammation de la mamelle. Au Canada</w:t>
       </w:r>
       <w:r>
         <w:t xml:space="preserve"> </w:t>
@@ -1608,7 +1604,7 @@
         <w:t xml:space="preserve"> </w:t>
       </w:r>
       <w:r>
-        <w:t xml:space="preserve">ont démontré que les vaches qui présentaient un SCC élevés les trois derniers mois de la précédente lactation, avaient plus de chance de présenter un SCC élevé durant le premier mois de la lactation en cours (ainsi qu’un SCC linear score plus élevé au cours de la lactation) . Ces mêmes vaches présentaient également une probabilité plus élevée d’être réformées. Il est tout de même important de rappeler qu’aux Etats-Unis, l’utilisation d’antibiotiques en élevage biologique est totalement interdite, les vaches nécessitant des traitements antimicrobiens doivent être retirées du troupeau, et leur produits devront passer en conventionnel.</w:t>
+        <w:t xml:space="preserve">ont démontré que les vaches qui présentaient un SCC élevés les trois derniers mois de la précédente lactation, avaient plus de chance de présenter un SCC élevé durant le premier mois de la lactation en cours (ainsi qu’un SCC linear score plus élevé au cours de la lactation). Ces mêmes vaches présentaient également une probabilité plus élevée d’être réformées. Il est tout de même important de rappeler qu’aux Etats-Unis, l’utilisation d’antibiotiques en élevage biologique est totalement interdite, les vaches nécessitant des traitements antimicrobiens doivent être retirées du troupeau, et leur produits devront passer en conventionnel.</w:t>
       </w:r>
     </w:p>
     <w:bookmarkEnd w:id="34"/>
@@ -1636,7 +1632,7 @@
         <w:pStyle w:val="FirstParagraph"/>
       </w:pPr>
       <w:r>
-        <w:t xml:space="preserve">La constante décroissante des performances de reproduction en élevage laitier est directement liée à la sélection génétique intense qui se fait sur  la capacité à produire plus de lait, au détriment des autres fonctions physiologiques de l’organisme. </w:t>
+        <w:t xml:space="preserve">La constante décroissance des performances de reproduction en élevage laitier est directement liée à la sélection génétique intense qui se fait sur la capacité à produire plus de lait, au détriment des autres fonctions physiologiques de l’organisme.</w:t>
       </w:r>
     </w:p>
     <w:p>
@@ -1644,7 +1640,7 @@
         <w:pStyle w:val="BodyText"/>
       </w:pPr>
       <w:r>
-        <w:t xml:space="preserve">La mammite est la maladie la plus commune et la plus répandue qui affecte les vaches laitières en France et dans le monde. </w:t>
+        <w:t xml:space="preserve">La mammite est la maladie la plus commune et la plus répandue qui affecte les vaches laitières en France et dans le monde.</w:t>
       </w:r>
     </w:p>
     <w:p>
@@ -1661,10 +1657,6 @@
         <w:t xml:space="preserve">(Hertl et al. 2010)</w:t>
       </w:r>
       <w:r>
-        <w:rPr>
-          <w:iCs/>
-          <w:i/>
-        </w:rPr>
         <w:t xml:space="preserve">.</w:t>
       </w:r>
     </w:p>
@@ -1696,7 +1688,7 @@
         <w:t xml:space="preserve">(Hertl et al. 2010)</w:t>
       </w:r>
       <w:r>
-        <w:t xml:space="preserve">, soulève et montre également l’hypothèse selon laquelle les mammites à Gram négatif avait un impact négatif plus important sur la reproduction que les mammites à Gram positif, quand celle-ci survient autour de la période de l’IA. Ce résultat semble contraster avec d’autres études qui n’ont trouvé aucune différence sur la catégorie du germe impliqué dans la mammite, sur la baisse de performance en reproduction. </w:t>
+        <w:t xml:space="preserve">, soulève et montre également l’hypothèse selon laquelle les mammites à Gram négatif avait un impact négatif plus important sur la reproduction que les mammites à Gram positif, quand celle-ci survient autour de la période de l’IA. Ce résultat semble contraster avec d’autres études qui n’ont trouvé aucune différence sur la catégorie du germe impliqué dans la mammite, sur la baisse de performance en reproduction.</w:t>
       </w:r>
     </w:p>
     <w:p>
@@ -1908,7 +1900,7 @@
         <w:pStyle w:val="FirstParagraph"/>
       </w:pPr>
       <w:r>
-        <w:t xml:space="preserve">Par exemple, si on considère qu’une vache est atteinte d’une infection intramammaire d’origine bactérienne, comment observer si la survenue de cette affection a pu causer à cette vache d’être réformée précocemment par rapport à une vache qui n’a jamais été atteinte d’une infection intramammaire.</w:t>
+        <w:t xml:space="preserve">Par exemple, si on considère qu’une vache est atteinte d’une infection intramammaire d’origine bactérienne, comment observer si la survenue de cette affection a pu causer à cette vache d’être réformée précocement par rapport à une vache qui n’a jamais été atteinte d’une infection intramammaire.</w:t>
       </w:r>
     </w:p>
     <w:p>
@@ -3735,7 +3727,7 @@
         <w:t xml:space="preserve">”</w:t>
       </w:r>
       <w:r>
-        <w:t xml:space="preserve">) de l’événement d’intérêt par rapport à l’absence de cet événement, lorsque la covariable change d’une unité. Plus précisément, pour une covariable</w:t>
+        <w:t xml:space="preserve">) de l’événement d’intérêt par rapport à l’absence de cet évènement, lorsque la covariable change d’une unité. Plus précisément, pour une covariable</w:t>
       </w:r>
       <w:r>
         <w:t xml:space="preserve"> </w:t>
@@ -4095,7 +4087,7 @@
         </m:r>
       </m:oMath>
       <w:r>
-        <w:t xml:space="preserve">, cela indique que la probabilité de l’événement (ici, la mise à la reproduction) est plus élevée lorsque</w:t>
+        <w:t xml:space="preserve">, cela indique que la probabilité de l’évènement (ici, la mise à la reproduction) est plus élevée lorsque</w:t>
       </w:r>
       <w:r>
         <w:t xml:space="preserve"> </w:t>
@@ -4161,7 +4153,7 @@
         </m:r>
       </m:oMath>
       <w:r>
-        <w:t xml:space="preserve">, l’événement est moins probable avec</w:t>
+        <w:t xml:space="preserve">, l’évènement est moins probable avec</w:t>
       </w:r>
       <w:r>
         <w:t xml:space="preserve"> </w:t>
@@ -4455,7 +4447,7 @@
         </m:r>
       </m:oMath>
       <w:r>
-        <w:t xml:space="preserve">. Le but de la régression de Poisson est de réussir a modéliser la loi suivante qui modélise la relation entre les varaibles explicatives et le paramètre</w:t>
+        <w:t xml:space="preserve">. Le but de la régression de Poisson est de réussir a modéliser la loi suivante qui modélise la relation entre les variables explicatives et le paramètre</w:t>
       </w:r>
       <w:r>
         <w:t xml:space="preserve"> </w:t>
@@ -4710,7 +4702,7 @@
         <w:t xml:space="preserve"> </w:t>
       </w:r>
       <w:r>
-        <w:t xml:space="preserve">qui mesure l’effet des variables explicatives sur le taux d’occurence de l’évènement.</w:t>
+        <w:t xml:space="preserve">qui mesure l’effet des variables explicatives sur le taux d’occurrence de l’évènement.</w:t>
       </w:r>
     </w:p>
     <w:p>
@@ -4998,7 +4990,19 @@
         <w:pStyle w:val="Compact"/>
       </w:pPr>
       <w:r>
-        <w:t xml:space="preserve">évaluer l’impact des mammites sur la longévité des vaches en élevage laitier, notamment en décrivant et en modélisant les dynamiques de réforme en fonction du statut vis-à-vis des mammites, - évaluer l’impact des réformes de vaches sur la dynamique des infections intramammaires autour du tarissement.</w:t>
+        <w:t xml:space="preserve">évaluer l’impact des mammites sur la longévité des vaches en élevage laitier, notamment en décrivant et en modélisant les dynamiques de réforme en fonction du statut vis-à-vis des mammites,</w:t>
+      </w:r>
+    </w:p>
+    <w:p>
+      <w:pPr>
+        <w:numPr>
+          <w:ilvl w:val="0"/>
+          <w:numId w:val="1004"/>
+        </w:numPr>
+        <w:pStyle w:val="Compact"/>
+      </w:pPr>
+      <w:r>
+        <w:t xml:space="preserve">évaluer l’impact des réformes de vaches sur la dynamique des infections intramammaires autour du tarissement.</w:t>
       </w:r>
     </w:p>
     <w:p>
@@ -7516,7 +7520,7 @@
         <w:pStyle w:val="FirstParagraph"/>
       </w:pPr>
       <w:r>
-        <w:t xml:space="preserve">La prochaine étape est de décrire la dynamique des infections intramammaires en se servant des comptages cellulaires fournis. Cette étude s’intéresse tout particulièrment au statut de chaque vache avant tarissement et après vêlage. Toute la période entre ces deux évènements est une zone d’ombre car aucune donnée du contrôle laitier ne permet avec certitude de connaître le statut des vache à chaque instant.</w:t>
+        <w:t xml:space="preserve">La prochaine étape est de décrire la dynamique des infections intramammaires en se servant des comptages cellulaires fournis. Cette étude s’intéresse tout particulièrement au statut de chaque vache avant tarissement et après vêlage. Toute la période entre ces deux évènements est une zone d’ombre car aucune donnée du contrôle laitier ne permet avec certitude de connaître le statut des vache à chaque instant.</w:t>
       </w:r>
     </w:p>
     <w:p>
@@ -7709,17 +7713,17 @@
     </w:p>
     <w:bookmarkEnd w:id="99"/>
     <w:bookmarkEnd w:id="100"/>
-    <w:bookmarkStart w:id="101" w:name="bibliogie"/>
+    <w:bookmarkStart w:id="101" w:name="bibliographie"/>
     <w:p>
       <w:pPr>
         <w:pStyle w:val="Heading1"/>
       </w:pPr>
       <w:r>
-        <w:t xml:space="preserve">4. Bibliogie</w:t>
+        <w:t xml:space="preserve">4. Bibliographie</w:t>
       </w:r>
     </w:p>
     <w:bookmarkEnd w:id="101"/>
-    <w:bookmarkStart w:id="205" w:name="annexes"/>
+    <w:bookmarkStart w:id="203" w:name="annexes"/>
     <w:p>
       <w:pPr>
         <w:pStyle w:val="Heading1"/>
@@ -7728,7 +7732,7 @@
         <w:t xml:space="preserve">5. Annexes</w:t>
       </w:r>
     </w:p>
-    <w:bookmarkStart w:id="204" w:name="refs"/>
+    <w:bookmarkStart w:id="202" w:name="refs"/>
     <w:bookmarkStart w:id="103" w:name="ref-adamczyk_associations_2017"/>
     <w:p>
       <w:pPr>
@@ -9945,31 +9949,31 @@
       </w:r>
     </w:p>
     <w:bookmarkEnd w:id="162"/>
-    <w:bookmarkStart w:id="164" w:name="ref-liang_estimating_2017"/>
+    <w:bookmarkStart w:id="164" w:name="ref-mazzetto_mapping_2022"/>
     <w:p>
       <w:pPr>
         <w:pStyle w:val="Bibliography"/>
       </w:pPr>
       <w:r>
-        <w:t xml:space="preserve">Liang, D., L. M. Arnold, C. J. Stowe, R. J. Harmon, and J. M. Bewley. 2017.</w:t>
-      </w:r>
-      <w:r>
-        <w:t xml:space="preserve"> </w:t>
-      </w:r>
-      <w:r>
-        <w:t xml:space="preserve">“Estimating</w:t>
-      </w:r>
-      <w:r>
-        <w:t xml:space="preserve"> </w:t>
-      </w:r>
-      <w:r>
-        <w:t xml:space="preserve">US</w:t>
-      </w:r>
-      <w:r>
-        <w:t xml:space="preserve"> </w:t>
-      </w:r>
-      <w:r>
-        <w:t xml:space="preserve">Dairy Clinical Disease Costs with a Stochastic Simulation Model.”</w:t>
+        <w:t xml:space="preserve">Mazzetto, Andre M., Shelley Falconer, and Stewart Ledgard. 2022.</w:t>
+      </w:r>
+      <w:r>
+        <w:t xml:space="preserve"> </w:t>
+      </w:r>
+      <w:r>
+        <w:t xml:space="preserve">“Mapping the Carbon Footprint of Milk Production from Cattle:</w:t>
+      </w:r>
+      <w:r>
+        <w:t xml:space="preserve"> </w:t>
+      </w:r>
+      <w:r>
+        <w:t xml:space="preserve">A</w:t>
+      </w:r>
+      <w:r>
+        <w:t xml:space="preserve"> </w:t>
+      </w:r>
+      <w:r>
+        <w:t xml:space="preserve">Systematic Review.”</w:t>
       </w:r>
       <w:r>
         <w:t xml:space="preserve"> </w:t>
@@ -9985,70 +9989,12 @@
         <w:t xml:space="preserve"> </w:t>
       </w:r>
       <w:r>
-        <w:t xml:space="preserve">100 (2): 1472–86.</w:t>
+        <w:t xml:space="preserve">105 (12): 9713–25.</w:t>
       </w:r>
       <w:r>
         <w:t xml:space="preserve"> </w:t>
       </w:r>
       <w:hyperlink r:id="rId163">
-        <w:r>
-          <w:rPr>
-            <w:rStyle w:val="Hyperlink"/>
-          </w:rPr>
-          <w:t xml:space="preserve">https://doi.org/10.3168/jds.2016-11565</w:t>
-        </w:r>
-      </w:hyperlink>
-      <w:r>
-        <w:t xml:space="preserve">.</w:t>
-      </w:r>
-    </w:p>
-    <w:bookmarkEnd w:id="164"/>
-    <w:bookmarkStart w:id="166" w:name="ref-mazzetto_mapping_2022"/>
-    <w:p>
-      <w:pPr>
-        <w:pStyle w:val="Bibliography"/>
-      </w:pPr>
-      <w:r>
-        <w:t xml:space="preserve">Mazzetto, Andre M., Shelley Falconer, and Stewart Ledgard. 2022.</w:t>
-      </w:r>
-      <w:r>
-        <w:t xml:space="preserve"> </w:t>
-      </w:r>
-      <w:r>
-        <w:t xml:space="preserve">“Mapping the Carbon Footprint of Milk Production from Cattle:</w:t>
-      </w:r>
-      <w:r>
-        <w:t xml:space="preserve"> </w:t>
-      </w:r>
-      <w:r>
-        <w:t xml:space="preserve">A</w:t>
-      </w:r>
-      <w:r>
-        <w:t xml:space="preserve"> </w:t>
-      </w:r>
-      <w:r>
-        <w:t xml:space="preserve">Systematic Review.”</w:t>
-      </w:r>
-      <w:r>
-        <w:t xml:space="preserve"> </w:t>
-      </w:r>
-      <w:r>
-        <w:rPr>
-          <w:iCs/>
-          <w:i/>
-        </w:rPr>
-        <w:t xml:space="preserve">Journal of Dairy Science</w:t>
-      </w:r>
-      <w:r>
-        <w:t xml:space="preserve"> </w:t>
-      </w:r>
-      <w:r>
-        <w:t xml:space="preserve">105 (12): 9713–25.</w:t>
-      </w:r>
-      <w:r>
-        <w:t xml:space="preserve"> </w:t>
-      </w:r>
-      <w:hyperlink r:id="rId165">
         <w:r>
           <w:rPr>
             <w:rStyle w:val="Hyperlink"/>
@@ -10060,8 +10006,8 @@
         <w:t xml:space="preserve">.</w:t>
       </w:r>
     </w:p>
-    <w:bookmarkEnd w:id="166"/>
-    <w:bookmarkStart w:id="168" w:name="ref-mohd_nor_estimating_2012"/>
+    <w:bookmarkEnd w:id="164"/>
+    <w:bookmarkStart w:id="166" w:name="ref-mohd_nor_estimating_2012"/>
     <w:p>
       <w:pPr>
         <w:pStyle w:val="Bibliography"/>
@@ -10106,7 +10052,7 @@
       <w:r>
         <w:t xml:space="preserve"> </w:t>
       </w:r>
-      <w:hyperlink r:id="rId167">
+      <w:hyperlink r:id="rId165">
         <w:r>
           <w:rPr>
             <w:rStyle w:val="Hyperlink"/>
@@ -10118,8 +10064,8 @@
         <w:t xml:space="preserve">.</w:t>
       </w:r>
     </w:p>
-    <w:bookmarkEnd w:id="168"/>
-    <w:bookmarkStart w:id="170" w:name="ref-neerhof_relationships_2000"/>
+    <w:bookmarkEnd w:id="166"/>
+    <w:bookmarkStart w:id="168" w:name="ref-neerhof_relationships_2000"/>
     <w:p>
       <w:pPr>
         <w:pStyle w:val="Bibliography"/>
@@ -10251,7 +10197,7 @@
       <w:r>
         <w:t xml:space="preserve"> </w:t>
       </w:r>
-      <w:hyperlink r:id="rId169">
+      <w:hyperlink r:id="rId167">
         <w:r>
           <w:rPr>
             <w:rStyle w:val="Hyperlink"/>
@@ -10263,8 +10209,8 @@
         <w:t xml:space="preserve">.</w:t>
       </w:r>
     </w:p>
-    <w:bookmarkEnd w:id="170"/>
-    <w:bookmarkStart w:id="172" w:name="ref-owusu-sekyere_dairy_2023"/>
+    <w:bookmarkEnd w:id="168"/>
+    <w:bookmarkStart w:id="170" w:name="ref-owusu-sekyere_dairy_2023"/>
     <w:p>
       <w:pPr>
         <w:pStyle w:val="Bibliography"/>
@@ -10309,7 +10255,7 @@
       <w:r>
         <w:t xml:space="preserve"> </w:t>
       </w:r>
-      <w:hyperlink r:id="rId171">
+      <w:hyperlink r:id="rId169">
         <w:r>
           <w:rPr>
             <w:rStyle w:val="Hyperlink"/>
@@ -10321,8 +10267,8 @@
         <w:t xml:space="preserve">.</w:t>
       </w:r>
     </w:p>
-    <w:bookmarkEnd w:id="172"/>
-    <w:bookmarkStart w:id="174" w:name="ref-perrin_analyse_2011"/>
+    <w:bookmarkEnd w:id="170"/>
+    <w:bookmarkStart w:id="172" w:name="ref-perrin_analyse_2011"/>
     <w:p>
       <w:pPr>
         <w:pStyle w:val="Bibliography"/>
@@ -10367,7 +10313,7 @@
       <w:r>
         <w:t xml:space="preserve"> </w:t>
       </w:r>
-      <w:hyperlink r:id="rId173">
+      <w:hyperlink r:id="rId171">
         <w:r>
           <w:rPr>
             <w:rStyle w:val="Hyperlink"/>
@@ -10379,8 +10325,8 @@
         <w:t xml:space="preserve">.</w:t>
       </w:r>
     </w:p>
-    <w:bookmarkEnd w:id="174"/>
-    <w:bookmarkStart w:id="176" w:name="ref-raboisson_herd-level_2011"/>
+    <w:bookmarkEnd w:id="172"/>
+    <w:bookmarkStart w:id="174" w:name="ref-raboisson_herd-level_2011"/>
     <w:p>
       <w:pPr>
         <w:pStyle w:val="Bibliography"/>
@@ -10425,7 +10371,7 @@
       <w:r>
         <w:t xml:space="preserve"> </w:t>
       </w:r>
-      <w:hyperlink r:id="rId175">
+      <w:hyperlink r:id="rId173">
         <w:r>
           <w:rPr>
             <w:rStyle w:val="Hyperlink"/>
@@ -10437,8 +10383,8 @@
         <w:t xml:space="preserve">.</w:t>
       </w:r>
     </w:p>
-    <w:bookmarkEnd w:id="176"/>
-    <w:bookmarkStart w:id="178" w:name="ref-rahman_chronic_2012"/>
+    <w:bookmarkEnd w:id="174"/>
+    <w:bookmarkStart w:id="176" w:name="ref-rahman_chronic_2012"/>
     <w:p>
       <w:pPr>
         <w:pStyle w:val="Bibliography"/>
@@ -10471,7 +10417,7 @@
       <w:r>
         <w:t xml:space="preserve"> </w:t>
       </w:r>
-      <w:hyperlink r:id="rId177">
+      <w:hyperlink r:id="rId175">
         <w:r>
           <w:rPr>
             <w:rStyle w:val="Hyperlink"/>
@@ -10483,8 +10429,8 @@
         <w:t xml:space="preserve">.</w:t>
       </w:r>
     </w:p>
-    <w:bookmarkEnd w:id="178"/>
-    <w:bookmarkStart w:id="180" w:name="ref-rilanto_culling_2020"/>
+    <w:bookmarkEnd w:id="176"/>
+    <w:bookmarkStart w:id="178" w:name="ref-rilanto_culling_2020"/>
     <w:p>
       <w:pPr>
         <w:pStyle w:val="Bibliography"/>
@@ -10529,7 +10475,7 @@
       <w:r>
         <w:t xml:space="preserve"> </w:t>
       </w:r>
-      <w:hyperlink r:id="rId179">
+      <w:hyperlink r:id="rId177">
         <w:r>
           <w:rPr>
             <w:rStyle w:val="Hyperlink"/>
@@ -10541,8 +10487,8 @@
         <w:t xml:space="preserve">.</w:t>
       </w:r>
     </w:p>
-    <w:bookmarkEnd w:id="180"/>
-    <w:bookmarkStart w:id="182" w:name="ref-rostellato_influence_2021"/>
+    <w:bookmarkEnd w:id="178"/>
+    <w:bookmarkStart w:id="180" w:name="ref-rostellato_influence_2021"/>
     <w:p>
       <w:pPr>
         <w:pStyle w:val="Bibliography"/>
@@ -10593,7 +10539,7 @@
       <w:r>
         <w:t xml:space="preserve"> </w:t>
       </w:r>
-      <w:hyperlink r:id="rId181">
+      <w:hyperlink r:id="rId179">
         <w:r>
           <w:rPr>
             <w:rStyle w:val="Hyperlink"/>
@@ -10605,8 +10551,8 @@
         <w:t xml:space="preserve">.</w:t>
       </w:r>
     </w:p>
-    <w:bookmarkEnd w:id="182"/>
-    <w:bookmarkStart w:id="184" w:name="ref-rozzi_total_2007"/>
+    <w:bookmarkEnd w:id="180"/>
+    <w:bookmarkStart w:id="182" w:name="ref-rozzi_total_2007"/>
     <w:p>
       <w:pPr>
         <w:pStyle w:val="Bibliography"/>
@@ -10696,7 +10642,7 @@
       <w:r>
         <w:t xml:space="preserve"> </w:t>
       </w:r>
-      <w:hyperlink r:id="rId183">
+      <w:hyperlink r:id="rId181">
         <w:r>
           <w:rPr>
             <w:rStyle w:val="Hyperlink"/>
@@ -10708,8 +10654,8 @@
         <w:t xml:space="preserve">.</w:t>
       </w:r>
     </w:p>
-    <w:bookmarkEnd w:id="184"/>
-    <w:bookmarkStart w:id="185" w:name="ref-rushen_i_nodate"/>
+    <w:bookmarkEnd w:id="182"/>
+    <w:bookmarkStart w:id="183" w:name="ref-rushen_i_nodate"/>
     <w:p>
       <w:pPr>
         <w:pStyle w:val="Bibliography"/>
@@ -10736,8 +10682,8 @@
         <w:t xml:space="preserve">Importance of Improving Cow Longevity.”</w:t>
       </w:r>
     </w:p>
-    <w:bookmarkEnd w:id="185"/>
-    <w:bookmarkStart w:id="187" w:name="ref-salat_etiology_2023"/>
+    <w:bookmarkEnd w:id="183"/>
+    <w:bookmarkStart w:id="185" w:name="ref-salat_etiology_2023"/>
     <w:p>
       <w:pPr>
         <w:pStyle w:val="Bibliography"/>
@@ -10782,7 +10728,7 @@
       <w:r>
         <w:t xml:space="preserve"> </w:t>
       </w:r>
-      <w:hyperlink r:id="rId186">
+      <w:hyperlink r:id="rId184">
         <w:r>
           <w:rPr>
             <w:rStyle w:val="Hyperlink"/>
@@ -10794,8 +10740,8 @@
         <w:t xml:space="preserve">.</w:t>
       </w:r>
     </w:p>
-    <w:bookmarkEnd w:id="187"/>
-    <w:bookmarkStart w:id="189" w:name="ref-schrick_influence_2001"/>
+    <w:bookmarkEnd w:id="185"/>
+    <w:bookmarkStart w:id="187" w:name="ref-schrick_influence_2001"/>
     <w:p>
       <w:pPr>
         <w:pStyle w:val="Bibliography"/>
@@ -10879,7 +10825,7 @@
       <w:r>
         <w:t xml:space="preserve"> </w:t>
       </w:r>
-      <w:hyperlink r:id="rId188">
+      <w:hyperlink r:id="rId186">
         <w:r>
           <w:rPr>
             <w:rStyle w:val="Hyperlink"/>
@@ -10891,8 +10837,8 @@
         <w:t xml:space="preserve">.</w:t>
       </w:r>
     </w:p>
-    <w:bookmarkEnd w:id="189"/>
-    <w:bookmarkStart w:id="191" w:name="ref-schuster_invited_2020"/>
+    <w:bookmarkEnd w:id="187"/>
+    <w:bookmarkStart w:id="189" w:name="ref-schuster_invited_2020"/>
     <w:p>
       <w:pPr>
         <w:pStyle w:val="Bibliography"/>
@@ -10958,7 +10904,7 @@
       <w:r>
         <w:t xml:space="preserve"> </w:t>
       </w:r>
-      <w:hyperlink r:id="rId190">
+      <w:hyperlink r:id="rId188">
         <w:r>
           <w:rPr>
             <w:rStyle w:val="Hyperlink"/>
@@ -10970,8 +10916,8 @@
         <w:t xml:space="preserve">.</w:t>
       </w:r>
     </w:p>
-    <w:bookmarkEnd w:id="191"/>
-    <w:bookmarkStart w:id="193" w:name="ref-seegers_reasons_1998"/>
+    <w:bookmarkEnd w:id="189"/>
+    <w:bookmarkStart w:id="191" w:name="ref-seegers_reasons_1998"/>
     <w:p>
       <w:pPr>
         <w:pStyle w:val="Bibliography"/>
@@ -11022,7 +10968,7 @@
       <w:r>
         <w:t xml:space="preserve"> </w:t>
       </w:r>
-      <w:hyperlink r:id="rId192">
+      <w:hyperlink r:id="rId190">
         <w:r>
           <w:rPr>
             <w:rStyle w:val="Hyperlink"/>
@@ -11034,8 +10980,8 @@
         <w:t xml:space="preserve">.</w:t>
       </w:r>
     </w:p>
-    <w:bookmarkEnd w:id="193"/>
-    <w:bookmarkStart w:id="195" w:name="ref-sewalem_analysis_2006"/>
+    <w:bookmarkEnd w:id="191"/>
+    <w:bookmarkStart w:id="193" w:name="ref-sewalem_analysis_2006"/>
     <w:p>
       <w:pPr>
         <w:pStyle w:val="Bibliography"/>
@@ -11143,7 +11089,7 @@
       <w:r>
         <w:t xml:space="preserve"> </w:t>
       </w:r>
-      <w:hyperlink r:id="rId194">
+      <w:hyperlink r:id="rId192">
         <w:r>
           <w:rPr>
             <w:rStyle w:val="Hyperlink"/>
@@ -11155,8 +11101,8 @@
         <w:t xml:space="preserve">.</w:t>
       </w:r>
     </w:p>
-    <w:bookmarkEnd w:id="195"/>
-    <w:bookmarkStart w:id="197" w:name="ref-sharun_advances_2021"/>
+    <w:bookmarkEnd w:id="193"/>
+    <w:bookmarkStart w:id="195" w:name="ref-sharun_advances_2021"/>
     <w:p>
       <w:pPr>
         <w:pStyle w:val="Bibliography"/>
@@ -11189,7 +11135,7 @@
       <w:r>
         <w:t xml:space="preserve"> </w:t>
       </w:r>
-      <w:hyperlink r:id="rId196">
+      <w:hyperlink r:id="rId194">
         <w:r>
           <w:rPr>
             <w:rStyle w:val="Hyperlink"/>
@@ -11201,8 +11147,8 @@
         <w:t xml:space="preserve">.</w:t>
       </w:r>
     </w:p>
-    <w:bookmarkEnd w:id="197"/>
-    <w:bookmarkStart w:id="199" w:name="ref-sinha_subclinical_2014"/>
+    <w:bookmarkEnd w:id="195"/>
+    <w:bookmarkStart w:id="197" w:name="ref-sinha_subclinical_2014"/>
     <w:p>
       <w:pPr>
         <w:pStyle w:val="Bibliography"/>
@@ -11295,7 +11241,7 @@
       <w:r>
         <w:t xml:space="preserve"> </w:t>
       </w:r>
-      <w:hyperlink r:id="rId198">
+      <w:hyperlink r:id="rId196">
         <w:r>
           <w:rPr>
             <w:rStyle w:val="Hyperlink"/>
@@ -11307,8 +11253,8 @@
         <w:t xml:space="preserve">.</w:t>
       </w:r>
     </w:p>
-    <w:bookmarkEnd w:id="199"/>
-    <w:bookmarkStart w:id="201" w:name="ref-stott_economic_1994"/>
+    <w:bookmarkEnd w:id="197"/>
+    <w:bookmarkStart w:id="199" w:name="ref-stott_economic_1994"/>
     <w:p>
       <w:pPr>
         <w:pStyle w:val="Bibliography"/>
@@ -11386,7 +11332,7 @@
       <w:r>
         <w:t xml:space="preserve"> </w:t>
       </w:r>
-      <w:hyperlink r:id="rId200">
+      <w:hyperlink r:id="rId198">
         <w:r>
           <w:rPr>
             <w:rStyle w:val="Hyperlink"/>
@@ -11398,8 +11344,8 @@
         <w:t xml:space="preserve">.</w:t>
       </w:r>
     </w:p>
-    <w:bookmarkEnd w:id="201"/>
-    <w:bookmarkStart w:id="203" w:name="ref-vries_economic_2017"/>
+    <w:bookmarkEnd w:id="199"/>
+    <w:bookmarkStart w:id="201" w:name="ref-vries_economic_2017"/>
     <w:p>
       <w:pPr>
         <w:pStyle w:val="Bibliography"/>
@@ -11432,7 +11378,7 @@
       <w:r>
         <w:t xml:space="preserve"> </w:t>
       </w:r>
-      <w:hyperlink r:id="rId202">
+      <w:hyperlink r:id="rId200">
         <w:r>
           <w:rPr>
             <w:rStyle w:val="Hyperlink"/>
@@ -11444,9 +11390,9 @@
         <w:t xml:space="preserve">.</w:t>
       </w:r>
     </w:p>
+    <w:bookmarkEnd w:id="201"/>
+    <w:bookmarkEnd w:id="202"/>
     <w:bookmarkEnd w:id="203"/>
-    <w:bookmarkEnd w:id="204"/>
-    <w:bookmarkEnd w:id="205"/>
     <w:sectPr/>
   </w:body>
 </w:document>

</xml_diff>